<commit_message>
Edit dokumen untuk laporan september
</commit_message>
<xml_diff>
--- a/Laporan SKC Desember 2025 - Copy.docx
+++ b/Laporan SKC Desember 2025 - Copy.docx
@@ -40,7 +40,7 @@
           <w:sz w:val="24"/>
           <w:szCs w:val="24"/>
         </w:rPr>
-        <w:t>MEI</w:t>
+        <w:t>SEPTEMBER</w:t>
       </w:r>
     </w:p>
     <w:p>
@@ -181,7 +181,7 @@
           <w:szCs w:val="24"/>
         </w:rPr>
         <w:tab/>
-        <w:t>: G</w:t>
+        <w:t xml:space="preserve">: </w:t>
       </w:r>
       <w:r>
         <w:rPr>
@@ -190,7 +190,7 @@
           <w:sz w:val="24"/>
           <w:szCs w:val="24"/>
         </w:rPr>
-        <w:t>enap</w:t>
+        <w:t>Ganjil</w:t>
       </w:r>
     </w:p>
     <w:p>
@@ -229,7 +229,25 @@
           <w:szCs w:val="24"/>
         </w:rPr>
         <w:tab/>
-        <w:t xml:space="preserve">: 2025 – 2026 </w:t>
+        <w:t xml:space="preserve">: </w:t>
+      </w:r>
+      <w:r>
+        <w:rPr>
+          <w:rFonts w:ascii="Times New Roman" w:eastAsia="Times New Roman" w:hAnsi="Times New Roman" w:cs="Times New Roman"/>
+          <w:b/>
+          <w:sz w:val="24"/>
+          <w:szCs w:val="24"/>
+        </w:rPr>
+        <w:t>2026 - 2027</w:t>
+      </w:r>
+      <w:r>
+        <w:rPr>
+          <w:rFonts w:ascii="Times New Roman" w:eastAsia="Times New Roman" w:hAnsi="Times New Roman" w:cs="Times New Roman"/>
+          <w:b/>
+          <w:sz w:val="24"/>
+          <w:szCs w:val="24"/>
+        </w:rPr>
+        <w:t xml:space="preserve"> </w:t>
       </w:r>
     </w:p>
     <w:p>
@@ -492,6 +510,22 @@
                 <w:sz w:val="24"/>
                 <w:szCs w:val="24"/>
               </w:rPr>
+              <w:t>5</w:t>
+            </w:r>
+            <w:r>
+              <w:rPr>
+                <w:rFonts w:ascii="Times New Roman" w:eastAsia="Times New Roman" w:hAnsi="Times New Roman" w:cs="Times New Roman"/>
+                <w:sz w:val="24"/>
+                <w:szCs w:val="24"/>
+              </w:rPr>
+              <w:t>.0</w:t>
+            </w:r>
+            <w:r>
+              <w:rPr>
+                <w:rFonts w:ascii="Times New Roman" w:eastAsia="Times New Roman" w:hAnsi="Times New Roman" w:cs="Times New Roman"/>
+                <w:sz w:val="24"/>
+                <w:szCs w:val="24"/>
+              </w:rPr>
               <w:t>9</w:t>
             </w:r>
             <w:r>
@@ -500,7 +534,7 @@
                 <w:sz w:val="24"/>
                 <w:szCs w:val="24"/>
               </w:rPr>
-              <w:t>.0</w:t>
+              <w:t>.202</w:t>
             </w:r>
             <w:r>
               <w:rPr>
@@ -510,22 +544,6 @@
               </w:rPr>
               <w:t>6</w:t>
             </w:r>
-            <w:r>
-              <w:rPr>
-                <w:rFonts w:ascii="Times New Roman" w:eastAsia="Times New Roman" w:hAnsi="Times New Roman" w:cs="Times New Roman"/>
-                <w:sz w:val="24"/>
-                <w:szCs w:val="24"/>
-              </w:rPr>
-              <w:t>.202</w:t>
-            </w:r>
-            <w:r>
-              <w:rPr>
-                <w:rFonts w:ascii="Times New Roman" w:eastAsia="Times New Roman" w:hAnsi="Times New Roman" w:cs="Times New Roman"/>
-                <w:sz w:val="24"/>
-                <w:szCs w:val="24"/>
-              </w:rPr>
-              <w:t>6</w:t>
-            </w:r>
           </w:p>
         </w:tc>
         <w:tc>
@@ -572,7 +590,7 @@
                 <w:sz w:val="24"/>
                 <w:szCs w:val="24"/>
               </w:rPr>
-              <w:t>Pengenalan Bahasa Pemrograman C++</w:t>
+              <w:t>Microsoft Word dan Tata Cara penulisan karya tulis ilmiah</w:t>
             </w:r>
           </w:p>
         </w:tc>
@@ -604,7 +622,15 @@
                 <w:sz w:val="24"/>
                 <w:szCs w:val="24"/>
               </w:rPr>
-              <w:t>belajar mengenai bahasa pemrograman komputer yaitu C++, dan beberapa perintah dasar untuk menulis program C++</w:t>
+              <w:t xml:space="preserve">belajar mengenai </w:t>
+            </w:r>
+            <w:r>
+              <w:rPr>
+                <w:rFonts w:ascii="Times New Roman" w:eastAsia="Times New Roman" w:hAnsi="Times New Roman" w:cs="Times New Roman"/>
+                <w:sz w:val="24"/>
+                <w:szCs w:val="24"/>
+              </w:rPr>
+              <w:t>dasar Microsoft word dengan pengenalan pada beberapa alat yang seringkali dipakai dalam membuat sebuah karya tulis ilmiah</w:t>
             </w:r>
           </w:p>
         </w:tc>
@@ -673,7 +699,7 @@
                 <w:sz w:val="24"/>
                 <w:szCs w:val="24"/>
               </w:rPr>
-              <w:t>16</w:t>
+              <w:t>12</w:t>
             </w:r>
             <w:r>
               <w:rPr>
@@ -689,7 +715,7 @@
                 <w:sz w:val="24"/>
                 <w:szCs w:val="24"/>
               </w:rPr>
-              <w:t>6</w:t>
+              <w:t>9</w:t>
             </w:r>
             <w:r>
               <w:rPr>
@@ -746,7 +772,7 @@
                 <w:sz w:val="24"/>
                 <w:szCs w:val="24"/>
               </w:rPr>
-              <w:t>Lanjutan Belajar Bahasa Pemrograman C++</w:t>
+              <w:t>Membuat makalah dengan profesional menggunakan microsoft word</w:t>
             </w:r>
           </w:p>
         </w:tc>
@@ -770,7 +796,23 @@
                 <w:sz w:val="24"/>
                 <w:szCs w:val="24"/>
               </w:rPr>
-              <w:t>Melatih siswa untuk terbiasa menulis sebuah program sederhana dari C++, dan membuat sebuah project sederhana untuk mengasah keterampilan mendasar seperti membuat algoritma sederhana menggunakan C++</w:t>
+              <w:t xml:space="preserve">Membekali siswa untuk </w:t>
+            </w:r>
+            <w:r>
+              <w:rPr>
+                <w:rFonts w:ascii="Times New Roman" w:eastAsia="Times New Roman" w:hAnsi="Times New Roman" w:cs="Times New Roman"/>
+                <w:sz w:val="24"/>
+                <w:szCs w:val="24"/>
+              </w:rPr>
+              <w:t xml:space="preserve">mengaplikasikan </w:t>
+            </w:r>
+            <w:r>
+              <w:rPr>
+                <w:rFonts w:ascii="Times New Roman" w:eastAsia="Times New Roman" w:hAnsi="Times New Roman" w:cs="Times New Roman"/>
+                <w:sz w:val="24"/>
+                <w:szCs w:val="24"/>
+              </w:rPr>
+              <w:t>microsoft word untuk membuat makalah bagi keperluan administrasi atau tugas</w:t>
             </w:r>
           </w:p>
         </w:tc>
@@ -839,15 +881,31 @@
                 <w:sz w:val="24"/>
                 <w:szCs w:val="24"/>
               </w:rPr>
-              <w:t>23</w:t>
-            </w:r>
-            <w:r>
-              <w:rPr>
-                <w:rFonts w:ascii="Times New Roman" w:eastAsia="Times New Roman" w:hAnsi="Times New Roman" w:cs="Times New Roman"/>
-                <w:sz w:val="24"/>
-                <w:szCs w:val="24"/>
-              </w:rPr>
-              <w:t>.06.2026</w:t>
+              <w:t>17</w:t>
+            </w:r>
+            <w:r>
+              <w:rPr>
+                <w:rFonts w:ascii="Times New Roman" w:eastAsia="Times New Roman" w:hAnsi="Times New Roman" w:cs="Times New Roman"/>
+                <w:sz w:val="24"/>
+                <w:szCs w:val="24"/>
+              </w:rPr>
+              <w:t>.0</w:t>
+            </w:r>
+            <w:r>
+              <w:rPr>
+                <w:rFonts w:ascii="Times New Roman" w:eastAsia="Times New Roman" w:hAnsi="Times New Roman" w:cs="Times New Roman"/>
+                <w:sz w:val="24"/>
+                <w:szCs w:val="24"/>
+              </w:rPr>
+              <w:t>9</w:t>
+            </w:r>
+            <w:r>
+              <w:rPr>
+                <w:rFonts w:ascii="Times New Roman" w:eastAsia="Times New Roman" w:hAnsi="Times New Roman" w:cs="Times New Roman"/>
+                <w:sz w:val="24"/>
+                <w:szCs w:val="24"/>
+              </w:rPr>
+              <w:t>.2026</w:t>
             </w:r>
           </w:p>
         </w:tc>
@@ -896,7 +954,7 @@
                 <w:sz w:val="24"/>
                 <w:szCs w:val="24"/>
               </w:rPr>
-              <w:t>Aplikasi C++ untuk Algoritma matematika</w:t>
+              <w:t>Lanjutan Hardware &amp; Troubleshooting</w:t>
             </w:r>
           </w:p>
         </w:tc>
@@ -920,7 +978,15 @@
                 <w:sz w:val="24"/>
                 <w:szCs w:val="24"/>
               </w:rPr>
-              <w:t xml:space="preserve">Membekali siswa untuk membuat algoritma matematika </w:t>
+              <w:t xml:space="preserve">Membekali siswa untuk belajar mengenai </w:t>
+            </w:r>
+            <w:r>
+              <w:rPr>
+                <w:rFonts w:ascii="Times New Roman" w:eastAsia="Times New Roman" w:hAnsi="Times New Roman" w:cs="Times New Roman"/>
+                <w:sz w:val="24"/>
+                <w:szCs w:val="24"/>
+              </w:rPr>
+              <w:t xml:space="preserve">masalah-masalah yang sering muncul di komputer </w:t>
             </w:r>
             <w:r>
               <w:rPr>
@@ -929,157 +995,7 @@
                 <w:szCs w:val="24"/>
               </w:rPr>
               <w:lastRenderedPageBreak/>
-              <w:t>menggunakan C++, sebagai contohnya menghitung KPK, FPB, dan mencari bilangan prima dari sebarang bilangan</w:t>
-            </w:r>
-          </w:p>
-        </w:tc>
-        <w:tc>
-          <w:tcPr>
-            <w:tcW w:w="1392" w:type="dxa"/>
-            <w:vAlign w:val="center"/>
-          </w:tcPr>
-          <w:p>
-            <w:pPr>
-              <w:jc w:val="center"/>
-              <w:rPr>
-                <w:rFonts w:ascii="Times New Roman" w:eastAsia="Times New Roman" w:hAnsi="Times New Roman" w:cs="Times New Roman"/>
-                <w:sz w:val="24"/>
-                <w:szCs w:val="24"/>
-              </w:rPr>
-            </w:pPr>
-          </w:p>
-        </w:tc>
-      </w:tr>
-      <w:tr>
-        <w:trPr>
-          <w:trHeight w:val="840"/>
-        </w:trPr>
-        <w:tc>
-          <w:tcPr>
-            <w:tcW w:w="430" w:type="dxa"/>
-            <w:vAlign w:val="center"/>
-          </w:tcPr>
-          <w:p>
-            <w:pPr>
-              <w:jc w:val="center"/>
-              <w:rPr>
-                <w:rFonts w:ascii="Times New Roman" w:eastAsia="Times New Roman" w:hAnsi="Times New Roman" w:cs="Times New Roman"/>
-                <w:sz w:val="24"/>
-                <w:szCs w:val="24"/>
-              </w:rPr>
-            </w:pPr>
-            <w:r>
-              <w:rPr>
-                <w:rFonts w:ascii="Times New Roman" w:eastAsia="Times New Roman" w:hAnsi="Times New Roman" w:cs="Times New Roman"/>
-                <w:sz w:val="24"/>
-                <w:szCs w:val="24"/>
-              </w:rPr>
-              <w:t>4</w:t>
-            </w:r>
-          </w:p>
-        </w:tc>
-        <w:tc>
-          <w:tcPr>
-            <w:tcW w:w="1147" w:type="dxa"/>
-            <w:vAlign w:val="center"/>
-          </w:tcPr>
-          <w:p>
-            <w:pPr>
-              <w:jc w:val="center"/>
-              <w:rPr>
-                <w:rFonts w:ascii="Times New Roman" w:eastAsia="Times New Roman" w:hAnsi="Times New Roman" w:cs="Times New Roman"/>
-                <w:sz w:val="24"/>
-                <w:szCs w:val="24"/>
-              </w:rPr>
-            </w:pPr>
-            <w:r>
-              <w:rPr>
-                <w:rFonts w:ascii="Times New Roman" w:eastAsia="Times New Roman" w:hAnsi="Times New Roman" w:cs="Times New Roman"/>
-                <w:sz w:val="24"/>
-                <w:szCs w:val="24"/>
-              </w:rPr>
-              <w:t>30</w:t>
-            </w:r>
-            <w:r>
-              <w:rPr>
-                <w:rFonts w:ascii="Times New Roman" w:eastAsia="Times New Roman" w:hAnsi="Times New Roman" w:cs="Times New Roman"/>
-                <w:sz w:val="24"/>
-                <w:szCs w:val="24"/>
-              </w:rPr>
-              <w:t>.06.2026</w:t>
-            </w:r>
-          </w:p>
-        </w:tc>
-        <w:tc>
-          <w:tcPr>
-            <w:tcW w:w="1707" w:type="dxa"/>
-            <w:vAlign w:val="center"/>
-          </w:tcPr>
-          <w:p>
-            <w:pPr>
-              <w:jc w:val="center"/>
-              <w:rPr>
-                <w:rFonts w:ascii="Times New Roman" w:eastAsia="Times New Roman" w:hAnsi="Times New Roman" w:cs="Times New Roman"/>
-                <w:sz w:val="24"/>
-                <w:szCs w:val="24"/>
-              </w:rPr>
-            </w:pPr>
-            <w:r>
-              <w:rPr>
-                <w:rFonts w:ascii="Times New Roman" w:eastAsia="Times New Roman" w:hAnsi="Times New Roman" w:cs="Times New Roman"/>
-                <w:sz w:val="24"/>
-                <w:szCs w:val="24"/>
-              </w:rPr>
-              <w:t>SMAN 1 Ciranjang</w:t>
-            </w:r>
-          </w:p>
-        </w:tc>
-        <w:tc>
-          <w:tcPr>
-            <w:tcW w:w="2283" w:type="dxa"/>
-            <w:vAlign w:val="center"/>
-          </w:tcPr>
-          <w:p>
-            <w:pPr>
-              <w:widowControl w:val="0"/>
-              <w:jc w:val="center"/>
-              <w:rPr>
-                <w:rFonts w:ascii="Times New Roman" w:eastAsia="Times New Roman" w:hAnsi="Times New Roman" w:cs="Times New Roman"/>
-                <w:sz w:val="24"/>
-                <w:szCs w:val="24"/>
-              </w:rPr>
-            </w:pPr>
-            <w:r>
-              <w:rPr>
-                <w:rFonts w:ascii="Times New Roman" w:eastAsia="Times New Roman" w:hAnsi="Times New Roman" w:cs="Times New Roman"/>
-                <w:sz w:val="24"/>
-                <w:szCs w:val="24"/>
-              </w:rPr>
-              <w:t>Algoritma Brute Force dan Divide and Conquer</w:t>
-            </w:r>
-          </w:p>
-        </w:tc>
-        <w:tc>
-          <w:tcPr>
-            <w:tcW w:w="2283" w:type="dxa"/>
-            <w:vAlign w:val="center"/>
-          </w:tcPr>
-          <w:p>
-            <w:pPr>
-              <w:jc w:val="center"/>
-              <w:rPr>
-                <w:rFonts w:ascii="Times New Roman" w:eastAsia="Times New Roman" w:hAnsi="Times New Roman" w:cs="Times New Roman"/>
-                <w:sz w:val="24"/>
-                <w:szCs w:val="24"/>
-              </w:rPr>
-            </w:pPr>
-            <w:r>
-              <w:rPr>
-                <w:rFonts w:ascii="Times New Roman" w:eastAsia="Times New Roman" w:hAnsi="Times New Roman" w:cs="Times New Roman"/>
-                <w:sz w:val="24"/>
-                <w:szCs w:val="24"/>
-              </w:rPr>
-              <w:t>Membekali siswa dengan mempelajari algoritma Brute Force dan Divide and Conquer untuk melatih problem solving dalam kehidupan sehari-hari. Contoh algoritma yang dipelajari ialah binary search, Bubble sort, dan prefix sum.</w:t>
+              <w:t>dan cara memperbaikinya</w:t>
             </w:r>
           </w:p>
         </w:tc>
@@ -1632,14 +1548,6 @@
                 <w:szCs w:val="24"/>
               </w:rPr>
             </w:pPr>
-            <w:r>
-              <w:rPr>
-                <w:rFonts w:ascii="Segoe UI" w:eastAsia="Times New Roman" w:hAnsi="Segoe UI" w:cs="Segoe UI"/>
-                <w:sz w:val="24"/>
-                <w:szCs w:val="24"/>
-              </w:rPr>
-              <w:t>√</w:t>
-            </w:r>
           </w:p>
         </w:tc>
         <w:tc>
@@ -1810,14 +1718,6 @@
                 <w:szCs w:val="24"/>
               </w:rPr>
             </w:pPr>
-            <w:r>
-              <w:rPr>
-                <w:rFonts w:ascii="Segoe UI" w:eastAsia="Times New Roman" w:hAnsi="Segoe UI" w:cs="Segoe UI"/>
-                <w:sz w:val="24"/>
-                <w:szCs w:val="24"/>
-              </w:rPr>
-              <w:t>√</w:t>
-            </w:r>
           </w:p>
         </w:tc>
         <w:tc>
@@ -1988,14 +1888,6 @@
                 <w:szCs w:val="24"/>
               </w:rPr>
             </w:pPr>
-            <w:r>
-              <w:rPr>
-                <w:rFonts w:ascii="Segoe UI" w:eastAsia="Times New Roman" w:hAnsi="Segoe UI" w:cs="Segoe UI"/>
-                <w:sz w:val="24"/>
-                <w:szCs w:val="24"/>
-              </w:rPr>
-              <w:t>√</w:t>
-            </w:r>
           </w:p>
         </w:tc>
         <w:tc>
@@ -2168,14 +2060,6 @@
                 <w:szCs w:val="24"/>
               </w:rPr>
             </w:pPr>
-            <w:r>
-              <w:rPr>
-                <w:rFonts w:ascii="Segoe UI" w:eastAsia="Times New Roman" w:hAnsi="Segoe UI" w:cs="Segoe UI"/>
-                <w:sz w:val="24"/>
-                <w:szCs w:val="24"/>
-              </w:rPr>
-              <w:t>√</w:t>
-            </w:r>
           </w:p>
         </w:tc>
         <w:tc>
@@ -2346,14 +2230,6 @@
                 <w:szCs w:val="24"/>
               </w:rPr>
             </w:pPr>
-            <w:r>
-              <w:rPr>
-                <w:rFonts w:ascii="Segoe UI" w:eastAsia="Times New Roman" w:hAnsi="Segoe UI" w:cs="Segoe UI"/>
-                <w:sz w:val="24"/>
-                <w:szCs w:val="24"/>
-              </w:rPr>
-              <w:t>√</w:t>
-            </w:r>
           </w:p>
         </w:tc>
         <w:tc>
@@ -2525,14 +2401,6 @@
                 <w:szCs w:val="24"/>
               </w:rPr>
             </w:pPr>
-            <w:r>
-              <w:rPr>
-                <w:rFonts w:ascii="Segoe UI" w:eastAsia="Times New Roman" w:hAnsi="Segoe UI" w:cs="Segoe UI"/>
-                <w:sz w:val="24"/>
-                <w:szCs w:val="24"/>
-              </w:rPr>
-              <w:t>√</w:t>
-            </w:r>
           </w:p>
         </w:tc>
         <w:tc>
@@ -2703,14 +2571,6 @@
                 <w:szCs w:val="24"/>
               </w:rPr>
             </w:pPr>
-            <w:r>
-              <w:rPr>
-                <w:rFonts w:ascii="Segoe UI" w:eastAsia="Times New Roman" w:hAnsi="Segoe UI" w:cs="Segoe UI"/>
-                <w:sz w:val="24"/>
-                <w:szCs w:val="24"/>
-              </w:rPr>
-              <w:t>√</w:t>
-            </w:r>
           </w:p>
         </w:tc>
         <w:tc>
@@ -2880,14 +2740,6 @@
                 <w:szCs w:val="24"/>
               </w:rPr>
             </w:pPr>
-            <w:r>
-              <w:rPr>
-                <w:rFonts w:ascii="Segoe UI" w:eastAsia="Times New Roman" w:hAnsi="Segoe UI" w:cs="Segoe UI"/>
-                <w:sz w:val="24"/>
-                <w:szCs w:val="24"/>
-              </w:rPr>
-              <w:t>√</w:t>
-            </w:r>
           </w:p>
         </w:tc>
         <w:tc>
@@ -3059,14 +2911,6 @@
                 <w:szCs w:val="24"/>
               </w:rPr>
             </w:pPr>
-            <w:r>
-              <w:rPr>
-                <w:rFonts w:ascii="Segoe UI" w:eastAsia="Times New Roman" w:hAnsi="Segoe UI" w:cs="Segoe UI"/>
-                <w:sz w:val="24"/>
-                <w:szCs w:val="24"/>
-              </w:rPr>
-              <w:t>√</w:t>
-            </w:r>
           </w:p>
         </w:tc>
         <w:tc>
@@ -3679,14 +3523,6 @@
                 <w:szCs w:val="24"/>
               </w:rPr>
             </w:pPr>
-            <w:r>
-              <w:rPr>
-                <w:rFonts w:ascii="Segoe UI" w:eastAsia="Times New Roman" w:hAnsi="Segoe UI" w:cs="Segoe UI"/>
-                <w:sz w:val="24"/>
-                <w:szCs w:val="24"/>
-              </w:rPr>
-              <w:t>√</w:t>
-            </w:r>
           </w:p>
         </w:tc>
         <w:tc>
@@ -4005,14 +3841,6 @@
                 <w:szCs w:val="24"/>
               </w:rPr>
             </w:pPr>
-            <w:r>
-              <w:rPr>
-                <w:rFonts w:ascii="Segoe UI" w:eastAsia="Times New Roman" w:hAnsi="Segoe UI" w:cs="Segoe UI"/>
-                <w:sz w:val="24"/>
-                <w:szCs w:val="24"/>
-              </w:rPr>
-              <w:t>√</w:t>
-            </w:r>
           </w:p>
         </w:tc>
         <w:tc>
@@ -4184,14 +4012,6 @@
                 <w:szCs w:val="24"/>
               </w:rPr>
             </w:pPr>
-            <w:r>
-              <w:rPr>
-                <w:rFonts w:ascii="Segoe UI" w:eastAsia="Times New Roman" w:hAnsi="Segoe UI" w:cs="Segoe UI"/>
-                <w:sz w:val="24"/>
-                <w:szCs w:val="24"/>
-              </w:rPr>
-              <w:t>√</w:t>
-            </w:r>
           </w:p>
         </w:tc>
         <w:tc>
@@ -4363,14 +4183,6 @@
                 <w:szCs w:val="24"/>
               </w:rPr>
             </w:pPr>
-            <w:r>
-              <w:rPr>
-                <w:rFonts w:ascii="Segoe UI" w:eastAsia="Times New Roman" w:hAnsi="Segoe UI" w:cs="Segoe UI"/>
-                <w:sz w:val="24"/>
-                <w:szCs w:val="24"/>
-              </w:rPr>
-              <w:t>√</w:t>
-            </w:r>
           </w:p>
         </w:tc>
         <w:tc>
@@ -4542,14 +4354,6 @@
                 <w:szCs w:val="24"/>
               </w:rPr>
             </w:pPr>
-            <w:r>
-              <w:rPr>
-                <w:rFonts w:ascii="Segoe UI" w:eastAsia="Times New Roman" w:hAnsi="Segoe UI" w:cs="Segoe UI"/>
-                <w:sz w:val="24"/>
-                <w:szCs w:val="24"/>
-              </w:rPr>
-              <w:t>√</w:t>
-            </w:r>
           </w:p>
         </w:tc>
         <w:tc>
@@ -4721,14 +4525,6 @@
                 <w:szCs w:val="24"/>
               </w:rPr>
             </w:pPr>
-            <w:r>
-              <w:rPr>
-                <w:rFonts w:ascii="Segoe UI" w:eastAsia="Times New Roman" w:hAnsi="Segoe UI" w:cs="Segoe UI"/>
-                <w:sz w:val="24"/>
-                <w:szCs w:val="24"/>
-              </w:rPr>
-              <w:t>√</w:t>
-            </w:r>
           </w:p>
         </w:tc>
         <w:tc>
@@ -4900,14 +4696,6 @@
                 <w:szCs w:val="24"/>
               </w:rPr>
             </w:pPr>
-            <w:r>
-              <w:rPr>
-                <w:rFonts w:ascii="Segoe UI" w:eastAsia="Times New Roman" w:hAnsi="Segoe UI" w:cs="Segoe UI"/>
-                <w:sz w:val="24"/>
-                <w:szCs w:val="24"/>
-              </w:rPr>
-              <w:t>√</w:t>
-            </w:r>
           </w:p>
         </w:tc>
         <w:tc>
@@ -5079,14 +4867,6 @@
                 <w:szCs w:val="24"/>
               </w:rPr>
             </w:pPr>
-            <w:r>
-              <w:rPr>
-                <w:rFonts w:ascii="Segoe UI" w:eastAsia="Times New Roman" w:hAnsi="Segoe UI" w:cs="Segoe UI"/>
-                <w:sz w:val="24"/>
-                <w:szCs w:val="24"/>
-              </w:rPr>
-              <w:t>√</w:t>
-            </w:r>
           </w:p>
         </w:tc>
         <w:tc>
@@ -5258,14 +5038,6 @@
                 <w:szCs w:val="24"/>
               </w:rPr>
             </w:pPr>
-            <w:r>
-              <w:rPr>
-                <w:rFonts w:ascii="Segoe UI" w:eastAsia="Times New Roman" w:hAnsi="Segoe UI" w:cs="Segoe UI"/>
-                <w:sz w:val="24"/>
-                <w:szCs w:val="24"/>
-              </w:rPr>
-              <w:t>√</w:t>
-            </w:r>
           </w:p>
         </w:tc>
         <w:tc>
@@ -5437,14 +5209,6 @@
                 <w:szCs w:val="24"/>
               </w:rPr>
             </w:pPr>
-            <w:r>
-              <w:rPr>
-                <w:rFonts w:ascii="Segoe UI" w:eastAsia="Times New Roman" w:hAnsi="Segoe UI" w:cs="Segoe UI"/>
-                <w:sz w:val="24"/>
-                <w:szCs w:val="24"/>
-              </w:rPr>
-              <w:t>√</w:t>
-            </w:r>
           </w:p>
         </w:tc>
         <w:tc>
@@ -5618,14 +5382,6 @@
                 <w:szCs w:val="24"/>
               </w:rPr>
             </w:pPr>
-            <w:r>
-              <w:rPr>
-                <w:rFonts w:ascii="Segoe UI" w:eastAsia="Times New Roman" w:hAnsi="Segoe UI" w:cs="Segoe UI"/>
-                <w:sz w:val="24"/>
-                <w:szCs w:val="24"/>
-              </w:rPr>
-              <w:t>√</w:t>
-            </w:r>
           </w:p>
         </w:tc>
         <w:tc>
@@ -5797,14 +5553,6 @@
                 <w:szCs w:val="24"/>
               </w:rPr>
             </w:pPr>
-            <w:r>
-              <w:rPr>
-                <w:rFonts w:ascii="Segoe UI" w:eastAsia="Times New Roman" w:hAnsi="Segoe UI" w:cs="Segoe UI"/>
-                <w:sz w:val="24"/>
-                <w:szCs w:val="24"/>
-              </w:rPr>
-              <w:t>√</w:t>
-            </w:r>
           </w:p>
         </w:tc>
         <w:tc>
@@ -5976,14 +5724,6 @@
                 <w:szCs w:val="24"/>
               </w:rPr>
             </w:pPr>
-            <w:r>
-              <w:rPr>
-                <w:rFonts w:ascii="Segoe UI" w:eastAsia="Times New Roman" w:hAnsi="Segoe UI" w:cs="Segoe UI"/>
-                <w:sz w:val="24"/>
-                <w:szCs w:val="24"/>
-              </w:rPr>
-              <w:t>√</w:t>
-            </w:r>
           </w:p>
         </w:tc>
         <w:tc>
@@ -6449,14 +6189,6 @@
                 <w:szCs w:val="24"/>
               </w:rPr>
             </w:pPr>
-            <w:r>
-              <w:rPr>
-                <w:rFonts w:ascii="Segoe UI" w:eastAsia="Times New Roman" w:hAnsi="Segoe UI" w:cs="Segoe UI"/>
-                <w:sz w:val="24"/>
-                <w:szCs w:val="24"/>
-              </w:rPr>
-              <w:t>√</w:t>
-            </w:r>
           </w:p>
         </w:tc>
         <w:tc>
@@ -6775,14 +6507,6 @@
                 <w:szCs w:val="24"/>
               </w:rPr>
             </w:pPr>
-            <w:r>
-              <w:rPr>
-                <w:rFonts w:ascii="Segoe UI" w:eastAsia="Times New Roman" w:hAnsi="Segoe UI" w:cs="Segoe UI"/>
-                <w:sz w:val="24"/>
-                <w:szCs w:val="24"/>
-              </w:rPr>
-              <w:t>√</w:t>
-            </w:r>
           </w:p>
         </w:tc>
         <w:tc>
@@ -6954,14 +6678,6 @@
                 <w:szCs w:val="24"/>
               </w:rPr>
             </w:pPr>
-            <w:r>
-              <w:rPr>
-                <w:rFonts w:ascii="Segoe UI" w:eastAsia="Times New Roman" w:hAnsi="Segoe UI" w:cs="Segoe UI"/>
-                <w:sz w:val="24"/>
-                <w:szCs w:val="24"/>
-              </w:rPr>
-              <w:t>√</w:t>
-            </w:r>
           </w:p>
         </w:tc>
         <w:tc>
@@ -7283,14 +6999,6 @@
                 <w:szCs w:val="24"/>
               </w:rPr>
             </w:pPr>
-            <w:r>
-              <w:rPr>
-                <w:rFonts w:ascii="Segoe UI" w:eastAsia="Times New Roman" w:hAnsi="Segoe UI" w:cs="Segoe UI"/>
-                <w:sz w:val="24"/>
-                <w:szCs w:val="24"/>
-              </w:rPr>
-              <w:t>√</w:t>
-            </w:r>
           </w:p>
         </w:tc>
         <w:tc>
@@ -7470,14 +7178,6 @@
                 <w:rFonts w:ascii="Times New Roman" w:eastAsia="Times New Roman" w:hAnsi="Times New Roman" w:cs="Times New Roman"/>
               </w:rPr>
             </w:pPr>
-            <w:r>
-              <w:rPr>
-                <w:rFonts w:ascii="Segoe UI" w:eastAsia="Times New Roman" w:hAnsi="Segoe UI" w:cs="Segoe UI"/>
-                <w:sz w:val="24"/>
-                <w:szCs w:val="24"/>
-              </w:rPr>
-              <w:t>√</w:t>
-            </w:r>
           </w:p>
         </w:tc>
         <w:tc>
@@ -7792,14 +7492,6 @@
                 <w:szCs w:val="24"/>
               </w:rPr>
             </w:pPr>
-            <w:r>
-              <w:rPr>
-                <w:rFonts w:ascii="Segoe UI" w:eastAsia="Times New Roman" w:hAnsi="Segoe UI" w:cs="Segoe UI"/>
-                <w:sz w:val="24"/>
-                <w:szCs w:val="24"/>
-              </w:rPr>
-              <w:t>√</w:t>
-            </w:r>
           </w:p>
         </w:tc>
         <w:tc>
@@ -8265,14 +7957,6 @@
                 <w:szCs w:val="24"/>
               </w:rPr>
             </w:pPr>
-            <w:r>
-              <w:rPr>
-                <w:rFonts w:ascii="Segoe UI" w:eastAsia="Times New Roman" w:hAnsi="Segoe UI" w:cs="Segoe UI"/>
-                <w:sz w:val="24"/>
-                <w:szCs w:val="24"/>
-              </w:rPr>
-              <w:t>√</w:t>
-            </w:r>
           </w:p>
         </w:tc>
         <w:tc>
@@ -8448,14 +8132,6 @@
                 <w:highlight w:val="white"/>
               </w:rPr>
             </w:pPr>
-            <w:r>
-              <w:rPr>
-                <w:rFonts w:ascii="Segoe UI" w:eastAsia="Times New Roman" w:hAnsi="Segoe UI" w:cs="Segoe UI"/>
-                <w:sz w:val="24"/>
-                <w:szCs w:val="24"/>
-              </w:rPr>
-              <w:t>√</w:t>
-            </w:r>
           </w:p>
         </w:tc>
         <w:tc>
@@ -8631,14 +8307,6 @@
                 <w:highlight w:val="white"/>
               </w:rPr>
             </w:pPr>
-            <w:r>
-              <w:rPr>
-                <w:rFonts w:ascii="Segoe UI" w:eastAsia="Times New Roman" w:hAnsi="Segoe UI" w:cs="Segoe UI"/>
-                <w:sz w:val="24"/>
-                <w:szCs w:val="24"/>
-              </w:rPr>
-              <w:t>√</w:t>
-            </w:r>
           </w:p>
         </w:tc>
         <w:tc>
@@ -8814,14 +8482,6 @@
                 <w:highlight w:val="white"/>
               </w:rPr>
             </w:pPr>
-            <w:r>
-              <w:rPr>
-                <w:rFonts w:ascii="Segoe UI" w:eastAsia="Times New Roman" w:hAnsi="Segoe UI" w:cs="Segoe UI"/>
-                <w:sz w:val="24"/>
-                <w:szCs w:val="24"/>
-              </w:rPr>
-              <w:t>√</w:t>
-            </w:r>
           </w:p>
         </w:tc>
         <w:tc>
@@ -8997,14 +8657,6 @@
                 <w:highlight w:val="white"/>
               </w:rPr>
             </w:pPr>
-            <w:r>
-              <w:rPr>
-                <w:rFonts w:ascii="Segoe UI" w:eastAsia="Times New Roman" w:hAnsi="Segoe UI" w:cs="Segoe UI"/>
-                <w:sz w:val="24"/>
-                <w:szCs w:val="24"/>
-              </w:rPr>
-              <w:t>√</w:t>
-            </w:r>
           </w:p>
         </w:tc>
         <w:tc>
@@ -9177,14 +8829,6 @@
                 <w:highlight w:val="white"/>
               </w:rPr>
             </w:pPr>
-            <w:r>
-              <w:rPr>
-                <w:rFonts w:ascii="Segoe UI" w:eastAsia="Times New Roman" w:hAnsi="Segoe UI" w:cs="Segoe UI"/>
-                <w:sz w:val="24"/>
-                <w:szCs w:val="24"/>
-              </w:rPr>
-              <w:t>√</w:t>
-            </w:r>
           </w:p>
         </w:tc>
         <w:tc>
@@ -9357,14 +9001,6 @@
                 <w:highlight w:val="white"/>
               </w:rPr>
             </w:pPr>
-            <w:r>
-              <w:rPr>
-                <w:rFonts w:ascii="Segoe UI" w:eastAsia="Times New Roman" w:hAnsi="Segoe UI" w:cs="Segoe UI"/>
-                <w:sz w:val="24"/>
-                <w:szCs w:val="24"/>
-              </w:rPr>
-              <w:t>√</w:t>
-            </w:r>
           </w:p>
         </w:tc>
         <w:tc>
@@ -9540,14 +9176,6 @@
                 <w:highlight w:val="white"/>
               </w:rPr>
             </w:pPr>
-            <w:r>
-              <w:rPr>
-                <w:rFonts w:ascii="Segoe UI" w:eastAsia="Times New Roman" w:hAnsi="Segoe UI" w:cs="Segoe UI"/>
-                <w:sz w:val="24"/>
-                <w:szCs w:val="24"/>
-              </w:rPr>
-              <w:t>√</w:t>
-            </w:r>
           </w:p>
         </w:tc>
         <w:tc>
@@ -9721,14 +9349,6 @@
                 <w:highlight w:val="white"/>
               </w:rPr>
             </w:pPr>
-            <w:r>
-              <w:rPr>
-                <w:rFonts w:ascii="Segoe UI" w:eastAsia="Times New Roman" w:hAnsi="Segoe UI" w:cs="Segoe UI"/>
-                <w:sz w:val="24"/>
-                <w:szCs w:val="24"/>
-              </w:rPr>
-              <w:t>√</w:t>
-            </w:r>
           </w:p>
         </w:tc>
         <w:tc>
@@ -10207,14 +9827,6 @@
                 <w:highlight w:val="white"/>
               </w:rPr>
             </w:pPr>
-            <w:r>
-              <w:rPr>
-                <w:rFonts w:ascii="Segoe UI" w:eastAsia="Times New Roman" w:hAnsi="Segoe UI" w:cs="Segoe UI"/>
-                <w:sz w:val="24"/>
-                <w:szCs w:val="24"/>
-              </w:rPr>
-              <w:t>√</w:t>
-            </w:r>
           </w:p>
         </w:tc>
         <w:tc>
@@ -10390,14 +10002,6 @@
                 <w:highlight w:val="white"/>
               </w:rPr>
             </w:pPr>
-            <w:r>
-              <w:rPr>
-                <w:rFonts w:ascii="Segoe UI" w:eastAsia="Times New Roman" w:hAnsi="Segoe UI" w:cs="Segoe UI"/>
-                <w:sz w:val="24"/>
-                <w:szCs w:val="24"/>
-              </w:rPr>
-              <w:t>√</w:t>
-            </w:r>
           </w:p>
         </w:tc>
         <w:tc>
@@ -10574,14 +10178,6 @@
                 <w:highlight w:val="white"/>
               </w:rPr>
             </w:pPr>
-            <w:r>
-              <w:rPr>
-                <w:rFonts w:ascii="Segoe UI" w:eastAsia="Times New Roman" w:hAnsi="Segoe UI" w:cs="Segoe UI"/>
-                <w:sz w:val="24"/>
-                <w:szCs w:val="24"/>
-              </w:rPr>
-              <w:t>√</w:t>
-            </w:r>
           </w:p>
         </w:tc>
         <w:tc>
@@ -10758,14 +10354,6 @@
                 <w:highlight w:val="white"/>
               </w:rPr>
             </w:pPr>
-            <w:r>
-              <w:rPr>
-                <w:rFonts w:ascii="Segoe UI" w:eastAsia="Times New Roman" w:hAnsi="Segoe UI" w:cs="Segoe UI"/>
-                <w:sz w:val="24"/>
-                <w:szCs w:val="24"/>
-              </w:rPr>
-              <w:t>√</w:t>
-            </w:r>
           </w:p>
         </w:tc>
         <w:tc>
@@ -10941,14 +10529,6 @@
                 <w:highlight w:val="white"/>
               </w:rPr>
             </w:pPr>
-            <w:r>
-              <w:rPr>
-                <w:rFonts w:ascii="Segoe UI" w:eastAsia="Times New Roman" w:hAnsi="Segoe UI" w:cs="Segoe UI"/>
-                <w:sz w:val="24"/>
-                <w:szCs w:val="24"/>
-              </w:rPr>
-              <w:t>√</w:t>
-            </w:r>
           </w:p>
         </w:tc>
         <w:tc>
@@ -11124,14 +10704,6 @@
                 <w:highlight w:val="white"/>
               </w:rPr>
             </w:pPr>
-            <w:r>
-              <w:rPr>
-                <w:rFonts w:ascii="Segoe UI" w:eastAsia="Times New Roman" w:hAnsi="Segoe UI" w:cs="Segoe UI"/>
-                <w:sz w:val="24"/>
-                <w:szCs w:val="24"/>
-              </w:rPr>
-              <w:t>√</w:t>
-            </w:r>
           </w:p>
         </w:tc>
         <w:tc>
@@ -11307,14 +10879,6 @@
                 <w:highlight w:val="white"/>
               </w:rPr>
             </w:pPr>
-            <w:r>
-              <w:rPr>
-                <w:rFonts w:ascii="Segoe UI" w:eastAsia="Times New Roman" w:hAnsi="Segoe UI" w:cs="Segoe UI"/>
-                <w:sz w:val="24"/>
-                <w:szCs w:val="24"/>
-              </w:rPr>
-              <w:t>√</w:t>
-            </w:r>
           </w:p>
         </w:tc>
         <w:tc>
@@ -11488,14 +11052,6 @@
                 <w:highlight w:val="white"/>
               </w:rPr>
             </w:pPr>
-            <w:r>
-              <w:rPr>
-                <w:rFonts w:ascii="Segoe UI" w:eastAsia="Times New Roman" w:hAnsi="Segoe UI" w:cs="Segoe UI"/>
-                <w:sz w:val="24"/>
-                <w:szCs w:val="24"/>
-              </w:rPr>
-              <w:t>√</w:t>
-            </w:r>
           </w:p>
         </w:tc>
         <w:tc>
@@ -11671,14 +11227,6 @@
                 <w:highlight w:val="white"/>
               </w:rPr>
             </w:pPr>
-            <w:r>
-              <w:rPr>
-                <w:rFonts w:ascii="Segoe UI" w:eastAsia="Times New Roman" w:hAnsi="Segoe UI" w:cs="Segoe UI"/>
-                <w:sz w:val="24"/>
-                <w:szCs w:val="24"/>
-              </w:rPr>
-              <w:t>√</w:t>
-            </w:r>
           </w:p>
         </w:tc>
         <w:tc>
@@ -11852,14 +11400,6 @@
                 <w:szCs w:val="24"/>
               </w:rPr>
             </w:pPr>
-            <w:r>
-              <w:rPr>
-                <w:rFonts w:ascii="Segoe UI" w:eastAsia="Times New Roman" w:hAnsi="Segoe UI" w:cs="Segoe UI"/>
-                <w:sz w:val="24"/>
-                <w:szCs w:val="24"/>
-              </w:rPr>
-              <w:t>√</w:t>
-            </w:r>
           </w:p>
         </w:tc>
         <w:tc>
@@ -12036,14 +11576,6 @@
                 <w:highlight w:val="white"/>
               </w:rPr>
             </w:pPr>
-            <w:r>
-              <w:rPr>
-                <w:rFonts w:ascii="Segoe UI" w:eastAsia="Times New Roman" w:hAnsi="Segoe UI" w:cs="Segoe UI"/>
-                <w:sz w:val="24"/>
-                <w:szCs w:val="24"/>
-              </w:rPr>
-              <w:t>√</w:t>
-            </w:r>
           </w:p>
         </w:tc>
         <w:tc>
@@ -12219,14 +11751,6 @@
                 <w:highlight w:val="white"/>
               </w:rPr>
             </w:pPr>
-            <w:r>
-              <w:rPr>
-                <w:rFonts w:ascii="Segoe UI" w:eastAsia="Times New Roman" w:hAnsi="Segoe UI" w:cs="Segoe UI"/>
-                <w:sz w:val="24"/>
-                <w:szCs w:val="24"/>
-              </w:rPr>
-              <w:t>√</w:t>
-            </w:r>
           </w:p>
         </w:tc>
         <w:tc>
@@ -12388,7 +11912,15 @@
                 <w:sz w:val="24"/>
                 <w:szCs w:val="24"/>
               </w:rPr>
-              <w:t xml:space="preserve"> Juni</w:t>
+              <w:t xml:space="preserve"> </w:t>
+            </w:r>
+            <w:r>
+              <w:rPr>
+                <w:rFonts w:ascii="Times New Roman" w:eastAsia="Times New Roman" w:hAnsi="Times New Roman" w:cs="Times New Roman"/>
+                <w:sz w:val="24"/>
+                <w:szCs w:val="24"/>
+              </w:rPr>
+              <w:t>September</w:t>
             </w:r>
             <w:r>
               <w:rPr>
@@ -13208,7 +12740,7 @@
           <w:sz w:val="24"/>
           <w:szCs w:val="24"/>
         </w:rPr>
-        <w:t>6</w:t>
+        <w:t>8</w:t>
       </w:r>
       <w:r>
         <w:rPr>
@@ -13253,6 +12785,30 @@
           <w:szCs w:val="24"/>
         </w:rPr>
       </w:pPr>
+    </w:p>
+    <w:p>
+      <w:pPr>
+        <w:spacing w:after="0" w:line="240" w:lineRule="auto"/>
+        <w:jc w:val="center"/>
+        <w:rPr>
+          <w:rFonts w:ascii="Times New Roman" w:eastAsia="Times New Roman" w:hAnsi="Times New Roman" w:cs="Times New Roman"/>
+          <w:b/>
+          <w:sz w:val="24"/>
+          <w:szCs w:val="24"/>
+        </w:rPr>
+      </w:pPr>
+    </w:p>
+    <w:p>
+      <w:pPr>
+        <w:spacing w:after="0" w:line="240" w:lineRule="auto"/>
+        <w:jc w:val="center"/>
+        <w:rPr>
+          <w:rFonts w:ascii="Times New Roman" w:eastAsia="Times New Roman" w:hAnsi="Times New Roman" w:cs="Times New Roman"/>
+          <w:b/>
+          <w:sz w:val="24"/>
+          <w:szCs w:val="24"/>
+        </w:rPr>
+      </w:pPr>
       <w:r>
         <w:rPr>
           <w:rFonts w:ascii="Times New Roman" w:eastAsia="Times New Roman" w:hAnsi="Times New Roman" w:cs="Times New Roman"/>
@@ -13262,10 +12818,10 @@
           <w:szCs w:val="24"/>
         </w:rPr>
         <w:drawing>
-          <wp:inline distT="0" distB="0" distL="0" distR="0" wp14:anchorId="26AF9B96" wp14:editId="2D178E8C">
+          <wp:inline distT="0" distB="0" distL="0" distR="0" wp14:anchorId="06D48C05" wp14:editId="3548AEA2">
             <wp:extent cx="5731510" cy="2520950"/>
             <wp:effectExtent l="0" t="0" r="2540" b="0"/>
-            <wp:docPr id="110548339" name="Picture 1"/>
+            <wp:docPr id="2069495628" name="Picture 1"/>
             <wp:cNvGraphicFramePr>
               <a:graphicFrameLocks xmlns:a="http://schemas.openxmlformats.org/drawingml/2006/main" noChangeAspect="1"/>
             </wp:cNvGraphicFramePr>
@@ -13273,11 +12829,86 @@
               <a:graphicData uri="http://schemas.openxmlformats.org/drawingml/2006/picture">
                 <pic:pic xmlns:pic="http://schemas.openxmlformats.org/drawingml/2006/picture">
                   <pic:nvPicPr>
-                    <pic:cNvPr id="110548339" name="Picture 110548339"/>
+                    <pic:cNvPr id="2069495628" name="Picture 2069495628"/>
                     <pic:cNvPicPr/>
                   </pic:nvPicPr>
                   <pic:blipFill>
                     <a:blip r:embed="rId11">
+                      <a:extLst>
+                        <a:ext uri="{28A0092B-C50C-407E-A947-70E740481C1C}">
+                          <a14:useLocalDpi xmlns:a14="http://schemas.microsoft.com/office/drawing/2010/main" val="0"/>
+                        </a:ext>
+                      </a:extLst>
+                    </a:blip>
+                    <a:stretch>
+                      <a:fillRect/>
+                    </a:stretch>
+                  </pic:blipFill>
+                  <pic:spPr>
+                    <a:xfrm>
+                      <a:off x="0" y="0"/>
+                      <a:ext cx="5731510" cy="2520950"/>
+                    </a:xfrm>
+                    <a:prstGeom prst="rect">
+                      <a:avLst/>
+                    </a:prstGeom>
+                  </pic:spPr>
+                </pic:pic>
+              </a:graphicData>
+            </a:graphic>
+          </wp:inline>
+        </w:drawing>
+      </w:r>
+    </w:p>
+    <w:p>
+      <w:pPr>
+        <w:spacing w:after="0" w:line="240" w:lineRule="auto"/>
+        <w:jc w:val="center"/>
+        <w:rPr>
+          <w:rFonts w:ascii="Times New Roman" w:eastAsia="Times New Roman" w:hAnsi="Times New Roman" w:cs="Times New Roman"/>
+          <w:b/>
+          <w:noProof/>
+          <w:sz w:val="24"/>
+          <w:szCs w:val="24"/>
+        </w:rPr>
+      </w:pPr>
+    </w:p>
+    <w:p>
+      <w:pPr>
+        <w:spacing w:after="0" w:line="240" w:lineRule="auto"/>
+        <w:jc w:val="center"/>
+        <w:rPr>
+          <w:rFonts w:ascii="Times New Roman" w:eastAsia="Times New Roman" w:hAnsi="Times New Roman" w:cs="Times New Roman"/>
+          <w:b/>
+          <w:sz w:val="24"/>
+          <w:szCs w:val="24"/>
+        </w:rPr>
+      </w:pPr>
+      <w:r>
+        <w:rPr>
+          <w:rFonts w:ascii="Times New Roman" w:eastAsia="Times New Roman" w:hAnsi="Times New Roman" w:cs="Times New Roman"/>
+          <w:b/>
+          <w:noProof/>
+          <w:sz w:val="24"/>
+          <w:szCs w:val="24"/>
+        </w:rPr>
+        <w:drawing>
+          <wp:inline distT="0" distB="0" distL="0" distR="0" wp14:anchorId="6FB01FD1" wp14:editId="4AB1188F">
+            <wp:extent cx="5731510" cy="2520950"/>
+            <wp:effectExtent l="0" t="0" r="2540" b="0"/>
+            <wp:docPr id="1181269101" name="Picture 2"/>
+            <wp:cNvGraphicFramePr>
+              <a:graphicFrameLocks xmlns:a="http://schemas.openxmlformats.org/drawingml/2006/main" noChangeAspect="1"/>
+            </wp:cNvGraphicFramePr>
+            <a:graphic xmlns:a="http://schemas.openxmlformats.org/drawingml/2006/main">
+              <a:graphicData uri="http://schemas.openxmlformats.org/drawingml/2006/picture">
+                <pic:pic xmlns:pic="http://schemas.openxmlformats.org/drawingml/2006/picture">
+                  <pic:nvPicPr>
+                    <pic:cNvPr id="1181269101" name="Picture 1181269101"/>
+                    <pic:cNvPicPr/>
+                  </pic:nvPicPr>
+                  <pic:blipFill>
+                    <a:blip r:embed="rId12">
                       <a:extLst>
                         <a:ext uri="{28A0092B-C50C-407E-A947-70E740481C1C}">
                           <a14:useLocalDpi xmlns:a14="http://schemas.microsoft.com/office/drawing/2010/main" val="0"/>
@@ -13327,56 +12958,18 @@
           <w:szCs w:val="24"/>
         </w:rPr>
       </w:pPr>
-      <w:r>
+    </w:p>
+    <w:p>
+      <w:pPr>
+        <w:spacing w:after="0" w:line="240" w:lineRule="auto"/>
+        <w:jc w:val="center"/>
         <w:rPr>
           <w:rFonts w:ascii="Times New Roman" w:eastAsia="Times New Roman" w:hAnsi="Times New Roman" w:cs="Times New Roman"/>
           <w:b/>
-          <w:noProof/>
           <w:sz w:val="24"/>
           <w:szCs w:val="24"/>
         </w:rPr>
-        <w:drawing>
-          <wp:inline distT="0" distB="0" distL="0" distR="0" wp14:anchorId="50FBC4DB" wp14:editId="3B4F0CB0">
-            <wp:extent cx="5731510" cy="3223895"/>
-            <wp:effectExtent l="0" t="0" r="2540" b="0"/>
-            <wp:docPr id="1530167607" name="Picture 2"/>
-            <wp:cNvGraphicFramePr>
-              <a:graphicFrameLocks xmlns:a="http://schemas.openxmlformats.org/drawingml/2006/main" noChangeAspect="1"/>
-            </wp:cNvGraphicFramePr>
-            <a:graphic xmlns:a="http://schemas.openxmlformats.org/drawingml/2006/main">
-              <a:graphicData uri="http://schemas.openxmlformats.org/drawingml/2006/picture">
-                <pic:pic xmlns:pic="http://schemas.openxmlformats.org/drawingml/2006/picture">
-                  <pic:nvPicPr>
-                    <pic:cNvPr id="1530167607" name="Picture 1530167607"/>
-                    <pic:cNvPicPr/>
-                  </pic:nvPicPr>
-                  <pic:blipFill>
-                    <a:blip r:embed="rId12">
-                      <a:extLst>
-                        <a:ext uri="{28A0092B-C50C-407E-A947-70E740481C1C}">
-                          <a14:useLocalDpi xmlns:a14="http://schemas.microsoft.com/office/drawing/2010/main" val="0"/>
-                        </a:ext>
-                      </a:extLst>
-                    </a:blip>
-                    <a:stretch>
-                      <a:fillRect/>
-                    </a:stretch>
-                  </pic:blipFill>
-                  <pic:spPr>
-                    <a:xfrm>
-                      <a:off x="0" y="0"/>
-                      <a:ext cx="5731510" cy="3223895"/>
-                    </a:xfrm>
-                    <a:prstGeom prst="rect">
-                      <a:avLst/>
-                    </a:prstGeom>
-                  </pic:spPr>
-                </pic:pic>
-              </a:graphicData>
-            </a:graphic>
-          </wp:inline>
-        </w:drawing>
-      </w:r>
+      </w:pPr>
     </w:p>
     <w:p>
       <w:pPr>

</xml_diff>